<commit_message>
content: the PE games and the Hong Kong then-and-now project run a 60-minute session in four segments
Requested by Henry (2026-10-18) for both pages: 課堂教案改為四段、共 60 分鐘.
The PE lesson keeps its two games and adds no third one — only the running
time of each activity grows (Game 1 plays 8–12 cards, Game 2's four steps are
retimed 8/4/4/6). The humanities project keeps every part and merges choosing
a path with the planning section. Both editions changed together; the PE
printable's Game 2 timings match the page, and the worksheet attachment is
untouched because it carries no time allocation.
</commit_message>
<xml_diff>
--- a/public/files/en/screen-free-ai-pe-games-p1-p3.docx
+++ b/public/files/en/screen-free-ai-pe-games-p1-p3.docx
@@ -390,7 +390,7 @@
           <w:rFonts w:ascii="Quicksand" w:hAnsi="Quicksand" w:cs="Quicksand" w:eastAsia="Noto Sans TC"/>
           <w:sz w:val="21"/>
         </w:rPr>
-        <w:t>Teach (about 4 min): one pupil is the "model", standing with their back to the class (or eyes closed). The teacher shows cards one by one (cat, dog, fish → animal; ball, car → not animal); the class says the correct label out loud so the model hears it. Repeat 4–5 cards, all correct.</w:t>
+        <w:t>Teach (about 8 min): one pupil is the "model", standing with their back to the class (or eyes closed). The teacher shows cards one by one (cat, dog, fish → animal; ball, car → not animal); the class says the correct label out loud so the model hears it. Repeat 4–5 cards, all correct; a second pupil can take a turn as the model with the same cards.</w:t>
       </w:r>
     </w:p>
     <w:p>
@@ -402,7 +402,7 @@
           <w:rFonts w:ascii="Quicksand" w:hAnsi="Quicksand" w:cs="Quicksand" w:eastAsia="Noto Sans TC"/>
           <w:sz w:val="21"/>
         </w:rPr>
-        <w:t>Test (about 2 min): show a new card (for example "bird"); the class stays silent; the model judges "animal / not animal" and steps into the matching zone.</w:t>
+        <w:t>Test (about 4 min): show a new card (for example "bird"); the class stays silent; the model judges "animal / not animal" and steps into the matching zone. One or two more new cards can be tested.</w:t>
       </w:r>
     </w:p>
     <w:p>
@@ -414,7 +414,7 @@
           <w:rFonts w:ascii="Quicksand" w:hAnsi="Quicksand" w:cs="Quicksand" w:eastAsia="Noto Sans TC"/>
           <w:sz w:val="21"/>
         </w:rPr>
-        <w:t>Add one wrong example (about 2 min): quietly show a "ball" card and signal the class to say "animal" on purpose. Test a new ball card again — the model now judges it as "animal".</w:t>
+        <w:t>Add one wrong example (about 4 min): quietly show a "ball" card and signal the class to say "animal" on purpose. Test a new ball card again — the model now judges it as "animal"; one more new card shows whether the model still gets it wrong.</w:t>
       </w:r>
     </w:p>
     <w:p>
@@ -426,7 +426,7 @@
           <w:rFonts w:ascii="Quicksand" w:hAnsi="Quicksand" w:cs="Quicksand" w:eastAsia="Noto Sans TC"/>
           <w:sz w:val="21"/>
         </w:rPr>
-        <w:t>Discuss (about 4 min): ask "Why did the model get it wrong?" → one wrong example was mixed into the teaching.</w:t>
+        <w:t>Discuss (about 6 min): ask "Why did the model get it wrong?" → one wrong example was mixed into the teaching.</w:t>
       </w:r>
     </w:p>
     <w:p>

</xml_diff>